<commit_message>
Hosea 2nd re-audit: 10 MSG restorations (ch3-6 major, ch8 Predictably), EN/KO mirrored, GDocs created 14/14 verified
</commit_message>
<xml_diff>
--- a/gdocs_build/Hosea.docx
+++ b/gdocs_build/Hosea.docx
@@ -1465,7 +1465,7 @@
               <w:rPr>
                 <w:sz w:val="18"/>
               </w:rPr>
-              <w:t>God then told me, “Go out again and love a woman who’s sleeping with other men, just like I love Israelites — because even though I keep loving them, they go after other gods like everything’s fine. They even take gifts to their gods.”</w:t>
+              <w:t>So I did it. I paid good money to get her back — it cost me the price of a slave. Then I told her, "From now on, you're living with me. No more cheating, no more sleeping around. You're living with me, and I'm living with you."</w:t>
             </w:r>
           </w:p>
         </w:tc>
@@ -1488,7 +1488,7 @@
               <w:rPr>
                 <w:sz w:val="18"/>
               </w:rPr>
-              <w:t>하나님이 나한테 또 말씀하셨다. “또 나가서 다른 남자들하고 자는 여자를 사랑해라. 내가 이스라엘 백성을 사랑하는 것처럼 말이야. 왜냐면 내가 계속 사랑하는데도, 걔네는 아무 일도 아니라는 듯이 다른 신들한테 가거든. 자기네 신들한테 선물까지 가져다 줘.”</w:t>
+              <w:t>그래서 내가 진짜로 그렇게 했어. 돈 주고 아내를 다시 데려왔지. 노예 한 명 값이나 했음. 그리고 걔한테 말했어. "이제부터 너는 나랑 같이 살아. 더 이상 바람피우지 마, 다른 남자랑 자지도 마. 너는 나랑 살고, 나는 너랑 살 거야."</w:t>
             </w:r>
           </w:p>
         </w:tc>
@@ -1505,7 +1505,7 @@
                 <w:b/>
                 <w:sz w:val="16"/>
               </w:rPr>
-              <w:t>4-5</w:t>
+              <w:t>4</w:t>
             </w:r>
           </w:p>
           <w:p>
@@ -1528,7 +1528,7 @@
                 <w:b/>
                 <w:sz w:val="16"/>
               </w:rPr>
-              <w:t>4-5</w:t>
+              <w:t>4</w:t>
             </w:r>
           </w:p>
           <w:p>
@@ -1536,7 +1536,7 @@
               <w:rPr>
                 <w:sz w:val="18"/>
               </w:rPr>
-              <w:t>Then you’ll sit there a long time, empty and alone — no lover, no friend. You’ll wait and you’ll wait for me. I’ll wait and wait for you.</w:t>
+              <w:t>Israel's in for a long, rough stretch — no security, no protection, no religion, no comfort. Godless and prayerless.</w:t>
             </w:r>
           </w:p>
         </w:tc>
@@ -1551,7 +1551,7 @@
                 <w:b/>
                 <w:sz w:val="16"/>
               </w:rPr>
-              <w:t>4-5</w:t>
+              <w:t>4</w:t>
             </w:r>
           </w:p>
           <w:p>
@@ -1559,7 +1559,7 @@
               <w:rPr>
                 <w:sz w:val="18"/>
               </w:rPr>
-              <w:t>그러면 너는 거기서 오랫동안 앉아 있을 거다. 텅 비고 외롭게 — 애인도 없고, 친구도 없고. 너는 나를 기다리고 또 기다릴 거야. 나도 너를 기다리고 또 기다릴 거다.</w:t>
+              <w:t>이스라엘 백성은 오랫동안 안전도 보호도 없이, 종교도 위로도 없이 살게 될 거임. 하나님도 없고, 기도도 없는 삶이야.</w:t>
             </w:r>
           </w:p>
         </w:tc>
@@ -1576,7 +1576,7 @@
                 <w:b/>
                 <w:sz w:val="16"/>
               </w:rPr>
-              <w:t>4-5</w:t>
+              <w:t>5</w:t>
             </w:r>
           </w:p>
           <w:p>
@@ -1599,7 +1599,7 @@
                 <w:b/>
                 <w:sz w:val="16"/>
               </w:rPr>
-              <w:t>4-5</w:t>
+              <w:t>5</w:t>
             </w:r>
           </w:p>
           <w:p>
@@ -1622,7 +1622,7 @@
                 <w:b/>
                 <w:sz w:val="16"/>
               </w:rPr>
-              <w:t>4-5</w:t>
+              <w:t>5</w:t>
             </w:r>
           </w:p>
           <w:p>
@@ -1785,7 +1785,7 @@
                 <w:b/>
                 <w:sz w:val="16"/>
               </w:rPr>
-              <w:t>4-10</w:t>
+              <w:t>4-6</w:t>
             </w:r>
           </w:p>
           <w:p>
@@ -1808,7 +1808,7 @@
                 <w:b/>
                 <w:sz w:val="16"/>
               </w:rPr>
-              <w:t>4-10</w:t>
+              <w:t>4-6</w:t>
             </w:r>
           </w:p>
           <w:p>
@@ -1816,7 +1816,7 @@
               <w:rPr>
                 <w:sz w:val="18"/>
               </w:rPr>
-              <w:t>There’s no truth, no faithfulness, and no knowledge of God anywhere in this country! People are constantly cursing, lying, murdering, stealing, and cheating. One murder after another. The more this goes on, the worse it gets. Even the animals and birds and fish are getting so fed up they’re taking off!</w:t>
+              <w:t>But don't go looking for someone else to blame. No finger-pointing! You, priest — you're the one on trial here. You stumble around in broad daylight, and then the prophets take over and stumble all night long. And your mother? She's just as bad as you.</w:t>
             </w:r>
           </w:p>
         </w:tc>
@@ -1831,7 +1831,7 @@
                 <w:b/>
                 <w:sz w:val="16"/>
               </w:rPr>
-              <w:t>4-10</w:t>
+              <w:t>4-6</w:t>
             </w:r>
           </w:p>
           <w:p>
@@ -1839,7 +1839,7 @@
               <w:rPr>
                 <w:sz w:val="18"/>
               </w:rPr>
-              <w:t>이 나라에는 진리도, 신실함도, 하나님을 아는 지식도 전혀 없어! 사람들은 계속 저주하고, 거짓말하고, 살인하고, 훔치고, 바람피워. 살인이 계속 이어져. 이게 계속될수록, 상황은 더 나빠져. 심지어 동물들이랑 새들이랑 물고기들까지 질려서 다 떠나고 있음!</w:t>
+              <w:t>근데 남 탓할 생각은 하지 마라. 손가락질 그만! 너, 제사장 — 바로 네가 재판대에 오른 피고인이다. 너는 대낮에도 비틀거리고, 그 다음엔 예언자들이 밤새 비틀거린대. 그리고 네 어머니도 너만큼 나빠.</w:t>
             </w:r>
           </w:p>
         </w:tc>
@@ -1856,7 +1856,7 @@
                 <w:b/>
                 <w:sz w:val="16"/>
               </w:rPr>
-              <w:t>11-14</w:t>
+              <w:t>7-10</w:t>
             </w:r>
           </w:p>
           <w:p>
@@ -1864,7 +1864,7 @@
               <w:rPr>
                 <w:sz w:val="18"/>
               </w:rPr>
-              <w:t>"Wine and whiskey leave my people in a stupor. They ask questions of a dead tree, expect answers from a sturdy walking stick. Drunk on sex, they can't find their way home. They've replaced their God with their genitals. They worship on the tops of mountains, make a picnic out of religion. Under the oaks and elms on the hills they stretch out and take it easy. Before you know it, your daughters are whores and the wives of your sons are sleeping around. But I'm not going after your whoring daughters or the adulterous wives of your sons. It's the men who pick up the whores that I'm after, the men who worship at the holy whorehouses— a stupid people, ruined by whores!</w:t>
+              <w:t>↑ 위 MSG(4-10) 계속</w:t>
             </w:r>
           </w:p>
         </w:tc>
@@ -1879,7 +1879,7 @@
                 <w:b/>
                 <w:sz w:val="16"/>
               </w:rPr>
-              <w:t>11-14</w:t>
+              <w:t>7-10</w:t>
             </w:r>
           </w:p>
           <w:p>
@@ -1887,7 +1887,7 @@
               <w:rPr>
                 <w:sz w:val="18"/>
               </w:rPr>
-              <w:t>“But don’t try to blame anyone else. Your priests are the main problem! You priests have rejected me, and my knowledge, my revelation, my holy Word. You’ve gotten too big for your britches. So I’ve gotten too big for you. I’m firing you as priests for good. You’ve turned your backs on God’s revelation, so now I’ll forget your children. “The more priests, the more sin. Your mother is as bad as you. You’ve traded God’s glory for the cheap thrills of prostitution. The more sex your people have with false gods, the more I’ll let them do. The worse their sin, the worse I’ll make it. They’ll eat their fill of it — eating the food offered to idols, but never getting enough. They’ll keep having sex with those false gods, but there won’t be any babies. Because they’ve abandoned God, they’ll end up empty-handed and impotent.”</w:t>
+              <w:t>My people are ruined because they don't know what's right or true. You priests turned your backs on knowledge, so I've turned my back on you. You refuse to recognize my revelation, so I'm done recognizing your children. The more priests, the more sin. You traded your glory for shame. You pig out on my people's sins and can't wait for the next evil thing. Now you can't even tell the people from the priests, or the priests from the people. I'm on my way to make you both pay for the wrecked lives you've lived. You'll eat and still be starving, sleep around and never be satisfied — because you walked out on me, your God, for a life of chasing prostitutes.</w:t>
             </w:r>
           </w:p>
         </w:tc>
@@ -1902,6 +1902,31 @@
                 <w:b/>
                 <w:sz w:val="16"/>
               </w:rPr>
+              <w:t>7-10</w:t>
+            </w:r>
+          </w:p>
+          <w:p>
+            <w:r>
+              <w:rPr>
+                <w:sz w:val="18"/>
+              </w:rPr>
+              <w:t>내 백성은 옹고 그른 것도 모른 채 망해가고 있어. 너희 제사장들이 지식을 등졌으니, 나도 너희를 등질 거야. 너희가 하나님의 계시를 인정하지 않으니, 나도 너희 자식들을 인정하지 않을 거임. 제사장이 많아질수록 죄도 많아져. 너희는 영광을 수치로 바꿔버렸어. 내 백성의 죄를 배불리 먹어치우고, 다음 악한 짓만 기다리고 있지. 이제는 백성과 제사장을 구분할 수도 없게 됐어. 너희가 망쳐놓은 삶에 대한 대가를 치르게 하러 내가 가고 있다. 먹어도 계속 배고프고, 막 살아도 만족은 없을 거야. 너희가 하나님인 나를 버리고 창녀들을 쫓아다뀬으니까.</w:t>
+            </w:r>
+          </w:p>
+        </w:tc>
+      </w:tr>
+      <w:tr>
+        <w:tc>
+          <w:tcPr>
+            <w:tcW w:type="dxa" w:w="2880"/>
+          </w:tcPr>
+          <w:p>
+            <w:r/>
+            <w:r>
+              <w:rPr>
+                <w:b/>
+                <w:sz w:val="16"/>
+              </w:rPr>
               <w:t>11-14</w:t>
             </w:r>
           </w:p>
@@ -1910,7 +1935,53 @@
               <w:rPr>
                 <w:sz w:val="18"/>
               </w:rPr>
-              <w:t>“근데 다른 사람 탓하지 마라. 니네 제사장들이 제일 큰 문제야! 너희 제사장들이 나를 거절했고, 나에 대한 지식, 내 계시, 내 거룩한 말씀을 거절했어. 너희가 너무 건방져졌거든. 그래서 나도 너희한테는 건방져질 거다. 너희를 제사장에서 영원히 해고할 거임. 너희가 하나님의 계시를 등졌으니, 나도 너희 자식들을 잊어버릴 거야. “제사장이 많아질수록, 죄도 많아져. 니네 어머니도 니네만큼 나빠. 너희가 하나님의 영광을 매춘의 싼 짜릿함이랑 바꿔버렸어. 너희 백성이 거짓 신들하고 섹스를 많이 할수록, 내가 더 하게 내버려둘 거야. 그들의 죄가 심할수록, 내가 더 심하게 만들 거야. 그들은 그걸로 배부르게 먹을 거다 — 우상에게 바친 음식을 먹지만, 절대 만족 못 해. 그 거짓 신들하고 계속 섹스하겠지만, 아기는 안 생길 거야. 그들이 하나님을 버렸으니까, 결국 빈손으로, 불능으로 끝날 거다.”</w:t>
+              <w:t>"Wine and whiskey leave my people in a stupor. They ask questions of a dead tree, expect answers from a sturdy walking stick. Drunk on sex, they can't find their way home. They've replaced their God with their genitals. They worship on the tops of mountains, make a picnic out of religion. Under the oaks and elms on the hills they stretch out and take it easy. Before you know it, your daughters are whores and the wives of your sons are sleeping around. But I'm not going after your whoring daughters or the adulterous wives of your sons. It's the men who pick up the whores that I'm after, the men who worship at the holy whorehouses— a stupid people, ruined by whores!</w:t>
+            </w:r>
+          </w:p>
+        </w:tc>
+        <w:tc>
+          <w:tcPr>
+            <w:tcW w:type="dxa" w:w="2880"/>
+          </w:tcPr>
+          <w:p>
+            <w:r/>
+            <w:r>
+              <w:rPr>
+                <w:b/>
+                <w:sz w:val="16"/>
+              </w:rPr>
+              <w:t>11-14</w:t>
+            </w:r>
+          </w:p>
+          <w:p>
+            <w:r>
+              <w:rPr>
+                <w:sz w:val="18"/>
+              </w:rPr>
+              <w:t>Wine and whiskey have my people totally out of it. They're asking questions to a dead tree, expecting answers from a walking stick. Drunk on sex, they can't even find their way home. They've traded their God for their own lust. They worship on mountaintops and make a picnic out of religion. Under the oaks and elms on the hills they stretch out and chill. And before you know it, your daughters are selling themselves and your sons' wives are sleeping around. But I'm not going after your promiscuous daughters or your sons' cheating wives — I'm going after the men who chase the prostitutes, the men who worship at those so-called holy brothels. A stupid people, ruined by prostitutes!</w:t>
+            </w:r>
+          </w:p>
+        </w:tc>
+        <w:tc>
+          <w:tcPr>
+            <w:tcW w:type="dxa" w:w="2880"/>
+          </w:tcPr>
+          <w:p>
+            <w:r/>
+            <w:r>
+              <w:rPr>
+                <w:b/>
+                <w:sz w:val="16"/>
+              </w:rPr>
+              <w:t>11-14</w:t>
+            </w:r>
+          </w:p>
+          <w:p>
+            <w:r>
+              <w:rPr>
+                <w:sz w:val="18"/>
+              </w:rPr>
+              <w:t>술이랑 양주가 내 백성을 완전히 정신 못 차리게 만들었어. 죽은 나무한테 물어보고, 튼튼한 지팡이한테 답을 기대하고 있지. 섹스에 취해서 집에 가는 길도 못 찾아. 자기네 하나님을 자기 욕망이랑 바꿔버렸어. 산꼭대기에서 예배하고, 종교를 소풍처럼 즐기고 있어. 언덕 위 떡갈나무랑 느릉나무 아래서 편하게 누워 쉬지. 그러다 보면 너희 딱들은 몸을 팔고, 너희 아들들의 아내들은 바람을 피우게 돼. 근데 나는 너희 음란한 딱들이나 간음하는 며느리들을 잡으러 가는 게 아냐. 창녀들을 찾아다니는 남자들, 그 신성하다는 매춘 소굴에서 예배하는 남자들을 잡으러 가는 거야. 어리석은 백성, 창녀들 때문에 망한 거지!</w:t>
             </w:r>
           </w:p>
         </w:tc>
@@ -2167,7 +2238,7 @@
               <w:rPr>
                 <w:sz w:val="18"/>
               </w:rPr>
-              <w:t>“Listen up, you priests! Watch out, Israel! Pay close attention, you kings! God is coming after you! You’re the ones responsible for all this mess at Mizpah and Tabor — those dirty traps you’ve been setting. But now I’m wising up to all your sneaky tricks and I’ll deal with you once and for all. I know where you’ve been, Israel. You can’t fool me. You’re an open book. Every breath you take is a prostitute’s breath — everything you do is an orgy. They can’t turn around, can’t come back to God, because every breath they take is a prostitute’s breath — prostitute-sickness has them in its grip. Your arrogance gives you away — you’ve fallen flat on your face. Israel’s fallen flat on its face. Judah will be right behind. They’ll come with sheep and cattle, but it won’t be enough. They won’t find God — not with things! God’s long gone from this place, totally done with them. “They’ve cheated on God. They’ve sired bastard offspring. But their party won’t last. Before you know it, they’ll be like sickly cattle, with a skin disease that spreads everywhere.”</w:t>
+              <w:t>I know you, Ephraim, inside and out. Yes, Israel — I see right through you! Ephraim, you've been playing your sex-and-religion games long enough. All of Israel is completely polluted. They couldn't turn to God even if they wanted to. Their evil life is just a bad habit now. Every breath they take is a prostitute's breath. They wouldn't recognize God if they saw him.</w:t>
             </w:r>
           </w:p>
         </w:tc>
@@ -2190,7 +2261,7 @@
               <w:rPr>
                 <w:sz w:val="18"/>
               </w:rPr>
-              <w:t>“들어봐, 제사장들아! 조심해라, 이스라엘! 잘 들어, 왕들아! 하나님이 니네를 쫓아오고 있음! 미스바와 다볼에서 이 난장판을 만든 건 니네야 — 너희가 쳐놓은 그 더러운 덫들 말이야. 근데 이제 내가 너희 몰래 꾸미는 짓들을 다 알아챘고, 한 번에 다 처리할 거야. 내가 너희가 어디 있었는지 다 안다, 이스라엘. 나를 속일 순 없어. 너희는 뻔히 다 보여. 너희가 내쉬는 숨결마다 창녀의 숨결이야 — 너희가 하는 모든 게 난잡한 파티야. 그들은 돌아설 수 없어, 하나님한테 돌아올 수 없어, 왜냐면 그들이 내쉬는 숨결마다 창녀의 숨결이거든 — 음란병이 그들을 사로잡았어. 너희 교만이 너희를 배신해 — 너희가 얼굴을 땅에 박고 넘어졌어. 이스라엘이 얼굴을 땅에 박고 넘어졌어. 유다도 바로 뒤따라 올 거야. 그들은 양이랑 소를 끌고 오겠지만, 그걸론 안 돼. 하나님을 못 찾을 거야 — 물건으로는 절대 안 돼! 하나님은 이 곳을 오래전에 떠나셨어, 걔네랑 완전히 끝났어. “그들이 하나님을 속였어. 사생아 자식들을 낳았어. 근데 그들의 파티는 오래 안 갈 거야. 눈 깜짝할 새에, 그들은 병든 소처럼 될 거야. 온몸에 퍼지는 피부병에 걸린 것처럼.”</w:t>
+              <w:t>에브라임, 내가 너를 속속들이 다 알아. 그래, 이스라엘 — 내가 너를 궾뚫어 보고 있다고! 에브라임, 너는 음란한 종교 놀이를 할 만큼 했어. 이스라엘 전체가 완전히 오염됐어. 걔네는 하나님께 돌아가고 싶어도 돌아갈 수 없어. 악한 삶이 그냥 나쁜 습관이 돼버린 거야. 걔네가 내쉬는 숨마다 창녀의 숨결이야. 하나님을 눈앞에서 봐도 알아보지 못할 거임.</w:t>
             </w:r>
           </w:p>
         </w:tc>
@@ -2380,7 +2451,7 @@
               <w:rPr>
                 <w:sz w:val="18"/>
               </w:rPr>
-              <w:t>“Ephraim is smashed to smithereens by the Assyrians — fickle and faithless before their neighbors. He had no faith in his own gods. He was just trying to get an inside track with the Assyrians, trying to get on their good side. But when Ephraim saw he was sick, and Judah saw his own tumorous condition, they went to Assyria for help. They hired the Assyrian king to fix things. But he can’t do anything about it! He can’t heal them! I’ll deal with Ephraim as a pus and with Judah as an oozing sore.”</w:t>
+              <w:t>Israel's rulers are crooks and thieves, cheating the people out of their land. And I'm angry — really angry. Every inch of their bodies is going to feel my anger.</w:t>
             </w:r>
           </w:p>
         </w:tc>
@@ -2403,7 +2474,7 @@
               <w:rPr>
                 <w:sz w:val="18"/>
               </w:rPr>
-              <w:t>“에브라임이 앗수르한테 완전히 박살 났어 — 이웃들 앞에서는 변덕스럽고 신실하지도 않으면서. 자기네 신들한테는 믿음도 없었어. 그냥 앗수르한테 잘 보이려고, 안쪽으로 줄을 대보려고 한 거야. 근데 에브라임이 자기가 병든 걸 보고, 유다가 자기 종양 같은 상태를 보고는, 앗수르한테 도움을 청했어. 앗수르 왕을 고용해서 해결해보려고. 근데 걔는 아무것도 못 해! 고칠 수 없어! 내가 에브라임을 고름처럼, 유다를 진물 나는 상처처럼 다룰 거다.”</w:t>
+              <w:t>이스라엘의 통치자들은 사기꾼이고 도둑이야. 백성들의 땅을 속여서 빼앗고 있지. 그리고 나는 화났다 — 진짜 화났어. 걔네 몸 구석구석이 내 분노를 느끼게 될 거야.</w:t>
             </w:r>
           </w:p>
         </w:tc>
@@ -2802,7 +2873,7 @@
               <w:rPr>
                 <w:sz w:val="18"/>
               </w:rPr>
-              <w:t>“What am I ever going to do with you? Oh, Ephraim! Oh, Judah! Your love evaporates in the morning dew, disappears like the morning fog. That’s why I’ve attacked them through my prophets and slaughtered them with my words — my judgment comes like lightning. I’m after love that lasts, not religion. I want you to know God, not go to more prayer meetings.</w:t>
+              <w:t>“What am I ever going to do with you? Oh, Ephraim! Oh, Judah! Your love evaporates in the morning dew, disappears like the morning fog. That’s why I’ve attacked them through my prophets and slaughtered them with my words — my judgment comes like lightning. I’m after love that lasts, not religion. I want you to know God, not go to more prayer meetings. You broke the covenant — just like Adam! You broke faith with me, you ungrateful wretches!</w:t>
             </w:r>
           </w:p>
         </w:tc>
@@ -2873,7 +2944,7 @@
               <w:rPr>
                 <w:sz w:val="18"/>
               </w:rPr>
-              <w:t>“They broke the covenant — just as they did at Adam. They betrayed me, ungrateful as ever. Gilead, crime city! Horrors on every street! As robbers ambush travelers, so gangs of priests murder people on their way to Shechem. They’re a bunch of no-good scoundrels.”</w:t>
+              <w:t>"Gilead has become Crime City — blood on the sidewalks, blood on the streets! It used to be robbers mugging people on the road. Now it's gangs of priests attacking worshipers on their way to Shechem. Nothing is sacred to them anymore."</w:t>
             </w:r>
           </w:p>
         </w:tc>
@@ -2896,7 +2967,7 @@
               <w:rPr>
                 <w:sz w:val="18"/>
               </w:rPr>
-              <w:t>“걔네는 언약을 깼어 — 아담에서 그랬던 것처럼. 나를 배신했어, 배은망덕하게도. 길르앗, 범죄 도시야! 길거리마다 끔찍한 일이 벌어져! 강도들이 여행자를 습격하듯이, 제사장 패거리들이 세겜으로 가는 사람들을 살해해. 걔네는 완전 막장들이야.”</w:t>
+              <w:t>"길르앗은 범죄 도시가 됐어. 인도에도 길거리에도 피가 낭자해! 원래는 강도들이 길 가던 사람들을 털었는데, 이제는 제사장 패거리들이 세겜으로 예배하러 가는 사람들을 공격하고 있어. 걔네한테는 신성한 거라곤 하나도 없어."</w:t>
             </w:r>
           </w:p>
         </w:tc>
@@ -3646,7 +3717,7 @@
               <w:rPr>
                 <w:sz w:val="18"/>
               </w:rPr>
-              <w:t>“Yo, blow the trumpet! Sound the alarm! Vultures are literally circling over God’s people because they completely broke my covenant and ignored my rules. And what’s their response? They cry out, ‘My God! We know you!’ but their actions are screaming the opposite. Israel wants nothing to do with what’s good, and now the enemy is hot on their trail.</w:t>
+              <w:t>“Yo, blow the trumpet! Sound the alarm! Vultures are literally circling over God’s people because they completely broke my covenant and ignored my rules. And predictably, what’s their response? They cry out, ‘My God! We know you!’ but their actions are screaming the opposite. Israel wants nothing to do with what’s good, and now the enemy is hot on their trail.</w:t>
             </w:r>
           </w:p>
         </w:tc>
@@ -3669,7 +3740,7 @@
               <w:rPr>
                 <w:sz w:val="18"/>
               </w:rPr>
-              <w:t>“야, 나팔 불어! 경보 울리라고! 독수리 떼가 하나님의 백성 위를 빙빙 돌고 있는 거임. 걔네가 내 언약을 깨고 내 가르침을 무시했거든. 근데 웃긴 건, 이스라엘이 ‘하나님! 우린 하나님 알잖아요!’ 하고 외친다는 거. 근데 행동은 완전 딴판인 거 알지? 이스라엘은 좋은 건 다 싫다 하고, 그러니 이제 적들이 걔네를 쫓아다니는 거지.</w:t>
+              <w:t>“야, 나팔 불어! 경보 울리라고! 독수리 떼가 하나님의 백성 위를 빙빙 돌고 있는 거임. 걔네가 내 언약을 깨고 내 가르침을 무시했거든. 근데 뻔하게도, 이스라엘이 ‘하나님! 우린 하나님 알잖아요!’ 하고 외친다는 거. 근데 행동은 완전 딴판인 거 알지? 이스라엘은 좋은 건 다 싫다 하고, 그러니 이제 적들이 걔네를 쫓아다니는 거지.</w:t>
             </w:r>
           </w:p>
         </w:tc>

</xml_diff>

<commit_message>
Hosea 2nd re-audit (Sep 24): offspring/locusts restore + led/shout-out/insane fixes + slang cleanup
- EN ch5 [5-7]: restored 'children born from unfaithfulness' (MSG 'bastard
  offspring', softened) + 'locust plague' (MSG 'plague of locusts'); KO already
  had both, EN/KO now match.
- EN ch11 [3-6]: 'I taught Ephraim how to walk' -> 'I led Ephraim' (MSG 'I led
  Ephraim'); 'gave me a shout-out' -> 'acknowledged my help'; 'murder rate is
  insane' -> 'murder rate is skyrocketing' (MSG 'skyrockets').
- KO ch11: '걸음마 가르쳐주고' -> '이끌어주고', '떡상' -> '치솟고'.
- ch8 [1-3]: dropped 'Yo'/'야' opener (MSG 'Blow the trumpet!'); KO '1도' ->
  '하나도', '실화냐?' -> '말이 되냐?'; ch9 KO '이딴' -> '이런'.
- Kept after review: 'bird-brained'/'새대가리' (MSG diction, mirrored),
  '24/7', '갈기갈기 찢어버릴' (faithful).
- Gates: STRUCT OK, rows=81 msg_units=66 all zero-drop gates, DOCX rows
  inspected, Google Docs re-uploaded 14/14, export-back VERIFIED OK.
  No push (local only).
</commit_message>
<xml_diff>
--- a/gdocs_build/Hosea.docx
+++ b/gdocs_build/Hosea.docx
@@ -2309,7 +2309,7 @@
               <w:rPr>
                 <w:sz w:val="18"/>
               </w:rPr>
-              <w:t>Your arrogance is off the charts, and honestly, it's a public embarrassment. All of you—Israel, Ephraim, and Judah—are just stumbling around in your own guilt. And when you finally decide to get your act together and look for God again, it's gonna be too late. I, God, will be long gone. You've been disloyal to me for way too long, and now your country is full of the consequences. A massive plague is about to wreck your trashed land.</w:t>
+              <w:t>Your arrogance is off the charts, and honestly, it's a public embarrassment. All of you—Israel, Ephraim, and Judah—are just stumbling around in your own guilt. And when you finally decide to get your act together and look for God again, it's gonna be too late. I, God, will be long gone. You've been disloyal to me for way too long, filling the whole country with children born from your unfaithfulness. A massive locust plague is about to wreck your trashed land.</w:t>
             </w:r>
           </w:p>
         </w:tc>
@@ -3717,7 +3717,7 @@
               <w:rPr>
                 <w:sz w:val="18"/>
               </w:rPr>
-              <w:t>“Yo, blow the trumpet! Sound the alarm! Vultures are literally circling over God’s people because they completely broke my covenant and ignored my rules. And predictably, what’s their response? They cry out, ‘My God! We know you!’ but their actions are screaming the opposite. Israel wants nothing to do with what’s good, and now the enemy is hot on their trail.</w:t>
+              <w:t>“Blow the trumpet! Sound the alarm! Vultures are literally circling over God’s people because they completely broke my covenant and ignored my rules. And predictably, what’s their response? They cry out, ‘My God! We know you!’ but their actions are screaming the opposite. Israel wants nothing to do with what’s good, and now the enemy is hot on their trail.</w:t>
             </w:r>
           </w:p>
         </w:tc>
@@ -3740,7 +3740,7 @@
               <w:rPr>
                 <w:sz w:val="18"/>
               </w:rPr>
-              <w:t>“야, 나팔 불어! 경보 울리라고! 독수리 떼가 하나님의 백성 위를 빙빙 돌고 있는 거임. 걔네가 내 언약을 깨고 내 가르침을 무시했거든. 근데 뻔하게도, 이스라엘이 ‘하나님! 우린 하나님 알잖아요!’ 하고 외친다는 거. 근데 행동은 완전 딴판인 거 알지? 이스라엘은 좋은 건 다 싫다 하고, 그러니 이제 적들이 걔네를 쫓아다니는 거지.</w:t>
+              <w:t>“나팔 불어! 경보 울리라고! 독수리 떼가 하나님의 백성 위를 빙빙 돌고 있는 거임. 걔네가 내 언약을 깨고 내 가르침을 무시했거든. 근데 뻔하게도, 이스라엘이 ‘하나님! 우린 하나님 알잖아요!’ 하고 외친다는 거. 근데 행동은 완전 딴판인 거 알지? 이스라엘은 좋은 건 다 싫다 하고, 그러니 이제 적들이 걔네를 쫓아다니는 거지.</w:t>
             </w:r>
           </w:p>
         </w:tc>
@@ -3811,7 +3811,7 @@
               <w:rPr>
                 <w:sz w:val="18"/>
               </w:rPr>
-              <w:t>쟤네는 나한테 물어보지도 않고 왕을 세웠대. 지도자들을 뽑으면서 나한테는 1도 안 알려줌. 대신 은이랑 금으로 우상을 만드는데, 그 우상 때문에 망하게 될 운명인 거임. 사마리아, 너네 그 금송아지 우상은 쓰레기 더미에나 던져버려! 나 그 쓰레기 땜에 엄청 화났음. 쟤네 언제 정신 차릴래? 심지어 이스라엘 백성이라면서! 어떤 조각가가 만든 걸 신이라고 모시는 거 실화냐? 그 사마리아 송아지는 결국 산산조각 날 거라고. 쟤네 좀 봐봐. 바람을 심으니까 토네이도를 거두는 거임. 이삭도 없는 밀에서 뭔 밀가루가 나오겠어. 설령 나온다 해도, 이방인들이 와서 다 먹어치울걸. 이스라엘은 완전히 먹혔다가 뱉어진 신세가 됐어. 다른 민족들 사이에서 그냥 고물 취급받는다고. 쟤네가 아시리아로 달려갔다니까? 아니, 진짜 야생 나귀도 자기 무리랑 같이 다니는데, 에브라임은 돈 주고 애인을 사려고 하네. 이제 쟤네가 이방인들 사이에서 하도 막 살아서, 내가 싹 다 모아서 따끔하게 혼내줄 거임. 곧 자기들이 한 짓의 대가를 치르고, 강대국 왕한테 짓밟히는 게 어떤 건지 느끼게 될걸.</w:t>
+              <w:t>쟤네는 나한테 물어보지도 않고 왕을 세웠대. 지도자들을 뽑으면서 나한테는 하나도 안 알려줌. 대신 은이랑 금으로 우상을 만드는데, 그 우상 때문에 망하게 될 운명인 거임. 사마리아, 너네 그 금송아지 우상은 쓰레기 더미에나 던져버려! 나 그 쓰레기 땜에 엄청 화났음. 쟤네 언제 정신 차릴래? 심지어 이스라엘 백성이라면서! 어떤 조각가가 만든 걸 신이라고 모시다니, 말이 되냐? 그 사마리아 송아지는 결국 산산조각 날 거라고. 쟤네 좀 봐봐. 바람을 심으니까 토네이도를 거두는 거임. 이삭도 없는 밀에서 뭔 밀가루가 나오겠어. 설령 나온다 해도, 이방인들이 와서 다 먹어치울걸. 이스라엘은 완전히 먹혔다가 뱉어진 신세가 됐어. 다른 민족들 사이에서 그냥 고물 취급받는다고. 쟤네가 아시리아로 달려갔다니까? 아니, 진짜 야생 나귀도 자기 무리랑 같이 다니는데, 에브라임은 돈 주고 애인을 사려고 하네. 이제 쟤네가 이방인들 사이에서 하도 막 살아서, 내가 싹 다 모아서 따끔하게 혼내줄 거임. 곧 자기들이 한 짓의 대가를 치르고, 강대국 왕한테 짓밟히는 게 어떤 건지 느끼게 될걸.</w:t>
             </w:r>
           </w:p>
         </w:tc>
@@ -4091,7 +4091,7 @@
               <w:rPr>
                 <w:sz w:val="18"/>
               </w:rPr>
-              <w:t>그렇게 파티에서 먹어봤자 배도 안 부를걸. 결국엔 더 배고파질 뿐이야. 이딴 식이면 하나님의 땅에서 얼마 못 버텨. 너네 중 일부는 이집트 가서 거지가 될 거고, 일부는 아시리아 가서 환상이 깨질 거다. 이집트랑 아시리아에서 난민으로 살면서 하나님을 예배할 기회나 있겠냐? 그냥 배급받는 빵이랑 물로 연명하고, 영적으로 더러운 공기 마시면서 네 영혼은 오염될 거임. 하나님을 갈망하며 굶주리게 되겠지만, 정작 하나님의 나라에선 쫓겨난 신세일걸. 옛날 명절들이 그리워질 것 같냐? 하나님께 드리던 축제가 그리울 것 같냐고?</w:t>
+              <w:t>그렇게 파티에서 먹어봤자 배도 안 부를걸. 결국엔 더 배고파질 뿐이야. 이런 식이면 하나님의 땅에서 얼마 못 버텨. 너네 중 일부는 이집트 가서 거지가 될 거고, 일부는 아시리아 가서 환상이 깨질 거다. 이집트랑 아시리아에서 난민으로 살면서 하나님을 예배할 기회나 있겠냐? 그냥 배급받는 빵이랑 물로 연명하고, 영적으로 더러운 공기 마시면서 네 영혼은 오염될 거임. 하나님을 갈망하며 굶주리게 되겠지만, 정작 하나님의 나라에선 쫓겨난 신세일걸. 옛날 명절들이 그리워질 것 같냐? 하나님께 드리던 축제가 그리울 것 같냐고?</w:t>
             </w:r>
           </w:p>
         </w:tc>
@@ -5267,7 +5267,7 @@
               <w:rPr>
                 <w:sz w:val="18"/>
               </w:rPr>
-              <w:t>Still, I was the one who stuck by him. I taught Ephraim how to walk, I rescued him from human bondage. But he never even gave me a shout-out, never admitted I was the one pulling his wagon, lifting him up like a baby to my cheek, and bending down to feed him. Now he wants to go back to Egypt or run off to Assyria — literally anywhere but back to me! That’s why his cities are a total mess, the murder rate is insane, and every plan they make just falls apart. My people are just hell-bent on leaving me. They’re praying to this Baal guy for help, but he’s not lifting a finger for them.</w:t>
+              <w:t>Still, I was the one who stuck by him. I led Ephraim, I rescued him from human bondage. But he never even acknowledged my help, never admitted I was the one pulling his wagon, lifting him up like a baby to my cheek, and bending down to feed him. Now he wants to go back to Egypt or run off to Assyria — literally anywhere but back to me! That’s why his cities are a total mess, the murder rate is skyrocketing, and every plan they make just falls apart. My people are just hell-bent on leaving me. They’re praying to this Baal guy for help, but he’s not lifting a finger for them.</w:t>
             </w:r>
           </w:p>
         </w:tc>
@@ -5290,7 +5290,7 @@
               <w:rPr>
                 <w:sz w:val="18"/>
               </w:rPr>
-              <w:t>그래도 내가 끝까지 챙겨줬어. 에브라임 걸음마도 내가 가르쳐주고, 인간 노예의 삶에서 구해줬는데, 걔는 내가 도와준 거 한 번도 인정 안 했어. 내가 수레를 끌어준 것도 모르고, 내가 아기처럼 볼에 들어 올려주고, 직접 먹여준 것도 모르는 거임. 근데 이제 와서 이집트로 돌아가고 싶대. 아니면 앗수르로 가든가. 하여튼 나한테만 안 오려고 하는 거임. 그러니 걔네 도시가 안전할 리가 있나. 살인율은 떡상하고, 뭘 해보려고 해도 다 망하는 거지. 내 백성은 나를 떠나기로 작정한 것 같아. 바알이라는 신한테 도와달라고 기도하는데, 걔가 손가락 하나 까딱하겠냐고.</w:t>
+              <w:t>그래도 내가 끝까지 챙겨줬어. 에브라임도 내가 이끌어주고, 인간 노예의 삶에서 구해줬는데, 걔는 내가 도와준 거 한 번도 인정 안 했어. 내가 수레를 끌어준 것도 모르고, 내가 아기처럼 볼에 들어 올려주고, 직접 먹여준 것도 모르는 거임. 근데 이제 와서 이집트로 돌아가고 싶대. 아니면 앗수르로 가든가. 하여튼 나한테만 안 오려고 하는 거임. 그러니 걔네 도시가 안전할 리가 있나. 살인율은 치솟고, 뭘 해보려고 해도 다 망하는 거지. 내 백성은 나를 떠나기로 작정한 것 같아. 바알이라는 신한테 도와달라고 기도하는데, 걔가 손가락 하나 까딱하겠냐고.</w:t>
             </w:r>
           </w:p>
         </w:tc>

</xml_diff>